<commit_message>
Refresh campus simulation and evaluation documentation
</commit_message>
<xml_diff>
--- a/Campus_Drive_AI_Project_Demonstration.docx
+++ b/Campus_Drive_AI_Project_Demonstration.docx
@@ -243,61 +243,28 @@
     </w:p>
     <w:p>
       <w:r>
-        <w:t>Campus Drive AI is a learning-focused robotics simulation in which a small differential-drive robot travels through a campus courtyard. ROS 2 Jazzy runs the robot logic, while Gazebo Harmonic provides the 3D world and simulated motion. The robot reads 2D LiDAR and wheel odometry, follows seven programmed waypoints, reacts to nearby obstacles, and records performance data.</w:t>
+        <w:t>Campus Drive AI is a learning-focused robotics simulation in which a small differential-drive robot travels through a campus courtyard. ROS 2 Jazzy runs the robot logic, while Gazebo Harmonic provides the 3D world and simulated motion. The robot reads 2D LiDAR and wheel odometry, follows nine programmed waypoints along an S-shaped route around three blocks, reacts to nearby obstacles, and records performance data.</w:t>
       </w:r>
     </w:p>
     <w:p>
       <w:r>
-        <w:t>The current project is a rule-based robotics prototype. It demonstrates sensing, control, simulation, and evaluation; it does not use a trained machine-learning model or the Nav2 navigation stack.</w:t>
+        <w:t>The current project is a rule-based robotics prototype. It demonstrates sensing, control, simulation, and evaluation; it does not use a trained machine-learning model, SLAM, or the Nav2 navigation stack.</w:t>
       </w:r>
     </w:p>
-    <w:tbl>
-      <w:tblPr>
-        <w:tblStyle w:val="TableGrid"/>
-        <w:tblW w:type="auto" w:w="0"/>
-        <w:tblLook w:firstColumn="1" w:firstRow="1" w:lastColumn="0" w:lastRow="0" w:noHBand="0" w:noVBand="1" w:val="04A0"/>
-      </w:tblPr>
-      <w:tblGrid>
-        <w:gridCol w:w="9994"/>
-      </w:tblGrid>
-      <w:tr>
-        <w:tc>
-          <w:tcPr>
-            <w:tcW w:type="dxa" w:w="9994"/>
-            <w:shd w:fill="EAF2F8"/>
-          </w:tcPr>
-          <w:p>
-            <w:pPr>
-              <w:spacing w:after="40"/>
-            </w:pPr>
-            <w:r>
-              <w:rPr>
-                <w:sz w:val="18"/>
-              </w:rPr>
-            </w:r>
-            <w:r>
-              <w:rPr>
-                <w:b/>
-                <w:color w:val="087E8B"/>
-                <w:sz w:val="18"/>
-              </w:rPr>
-              <w:t xml:space="preserve">Demonstration goal  </w:t>
-            </w:r>
-            <w:r>
-              <w:rPr>
-                <w:color w:val="263238"/>
-                <w:sz w:val="18"/>
-              </w:rPr>
-              <w:t>Show the campus scene, the car-style robot, LiDAR and odometry topics, waypoint progress, obstacle response, and the completion indicator that changes from STARTED to FINISHED.</w:t>
-            </w:r>
-          </w:p>
-        </w:tc>
-      </w:tr>
-    </w:tbl>
     <w:p>
       <w:pPr>
-        <w:spacing w:after="0"/>
+        <w:spacing w:before="60" w:after="120"/>
       </w:pPr>
+      <w:r>
+        <w:rPr>
+          <w:b/>
+          <w:color w:val="087E8B"/>
+        </w:rPr>
+        <w:t xml:space="preserve">Demonstration goal: </w:t>
+      </w:r>
+      <w:r>
+        <w:t>Show the campus scene, the car-style robot, LiDAR and odometry topics, waypoint progress, obstacle response, and the completion indicator that changes from SIMULATION STARTED to ROUTE FINISHED.</w:t>
+      </w:r>
     </w:p>
     <w:p>
       <w:pPr>
@@ -669,7 +636,7 @@
         <w:spacing w:after="60"/>
       </w:pPr>
       <w:r>
-        <w:t>Follow a seven-waypoint route and return to the shared start and finish location.</w:t>
+        <w:t>Follow nine S-shaped route targets from the green start pad at (-3.8, 1.7) m to the red destination at (3.8, 1.7) m, passing around three fixed blocks.</w:t>
       </w:r>
     </w:p>
     <w:p>
@@ -678,7 +645,7 @@
         <w:spacing w:after="60"/>
       </w:pPr>
       <w:r>
-        <w:t>Use LiDAR readings to trigger a basic obstacle-avoidance response.</w:t>
+        <w:t>Use forward LiDAR distance and side clearance to trigger a reactive obstacle response.</w:t>
       </w:r>
     </w:p>
     <w:p>
@@ -1476,7 +1443,7 @@
                 <w:color w:val="263238"/>
                 <w:sz w:val="17"/>
               </w:rPr>
-              <w:t>/campus_navigation/succeeded</w:t>
+              <w:t>/campus_navigation/obstacle_detected</w:t>
             </w:r>
           </w:p>
         </w:tc>
@@ -1518,7 +1485,7 @@
                 <w:color w:val="263238"/>
                 <w:sz w:val="17"/>
               </w:rPr>
-              <w:t>Signals when the route is complete.</w:t>
+              <w:t>Latches true after a valid nearby LiDAR return.</w:t>
             </w:r>
           </w:p>
         </w:tc>
@@ -1542,7 +1509,7 @@
                 <w:color w:val="263238"/>
                 <w:sz w:val="17"/>
               </w:rPr>
-              <w:t>/campus_navigation/mode</w:t>
+              <w:t>/campus_navigation/succeeded</w:t>
             </w:r>
           </w:p>
         </w:tc>
@@ -1564,6 +1531,72 @@
                 <w:color w:val="263238"/>
                 <w:sz w:val="17"/>
               </w:rPr>
+              <w:t>std_msgs/msg/Bool</w:t>
+            </w:r>
+          </w:p>
+        </w:tc>
+        <w:tc>
+          <w:tcPr>
+            <w:tcW w:type="dxa" w:w="3528"/>
+            <w:vAlign w:val="center"/>
+            <w:shd w:fill="F3F6F9"/>
+          </w:tcPr>
+          <w:p>
+            <w:pPr>
+              <w:spacing w:after="20"/>
+            </w:pPr>
+            <w:r/>
+            <w:r>
+              <w:rPr>
+                <w:rFonts w:ascii="Aptos" w:hAnsi="Aptos"/>
+                <w:b w:val="0"/>
+                <w:color w:val="263238"/>
+                <w:sz w:val="17"/>
+              </w:rPr>
+              <w:t>Signals when all route targets are reached.</w:t>
+            </w:r>
+          </w:p>
+        </w:tc>
+      </w:tr>
+      <w:tr>
+        <w:tc>
+          <w:tcPr>
+            <w:tcW w:type="dxa" w:w="2952"/>
+            <w:vAlign w:val="center"/>
+          </w:tcPr>
+          <w:p>
+            <w:pPr>
+              <w:spacing w:after="20"/>
+            </w:pPr>
+            <w:r/>
+            <w:r>
+              <w:rPr>
+                <w:rFonts w:ascii="Aptos" w:hAnsi="Aptos"/>
+                <w:b w:val="0"/>
+                <w:color w:val="263238"/>
+                <w:sz w:val="17"/>
+              </w:rPr>
+              <w:t>/campus_navigation/mode</w:t>
+            </w:r>
+          </w:p>
+        </w:tc>
+        <w:tc>
+          <w:tcPr>
+            <w:tcW w:type="dxa" w:w="3240"/>
+            <w:vAlign w:val="center"/>
+          </w:tcPr>
+          <w:p>
+            <w:pPr>
+              <w:spacing w:after="20"/>
+            </w:pPr>
+            <w:r/>
+            <w:r>
+              <w:rPr>
+                <w:rFonts w:ascii="Aptos" w:hAnsi="Aptos"/>
+                <w:b w:val="0"/>
+                <w:color w:val="263238"/>
+                <w:sz w:val="17"/>
+              </w:rPr>
               <w:t>std_msgs/msg/String</w:t>
             </w:r>
           </w:p>
@@ -1572,7 +1605,6 @@
           <w:tcPr>
             <w:tcW w:type="dxa" w:w="3528"/>
             <w:vAlign w:val="center"/>
-            <w:shd w:fill="F3F6F9"/>
           </w:tcPr>
           <w:p>
             <w:pPr>
@@ -1643,7 +1675,7 @@
     </w:p>
     <w:p>
       <w:r>
-        <w:t>The SDF world contains a paved T-shaped route, lawn areas, four campus buildings, trees, and courtyard planters. The robot has a differential-drive base, a blue vehicle-style shell, a planar LiDAR, and wheel odometry. A green start marker and red finish marker indicate the shared route endpoint.</w:t>
+        <w:t>The SDF world contains campus buildings, a paved courtyard, lawn areas, trees, planters, and three fixed blocks. The robot has a differential-drive base, a blue vehicle-style shell, a planar LiDAR, and wheel odometry. The green start pad is at (-3.8, 1.7) m; the separate red destination is at (3.8, 1.7) m, 7.6 m away.</w:t>
       </w:r>
     </w:p>
     <w:p>
@@ -1750,7 +1782,7 @@
                 <w:color w:val="263238"/>
                 <w:sz w:val="17"/>
               </w:rPr>
-              <w:t>Paved T-shaped route</w:t>
+              <w:t>Yellow S-shaped route</w:t>
             </w:r>
           </w:p>
         </w:tc>
@@ -1771,7 +1803,7 @@
                 <w:color w:val="263238"/>
                 <w:sz w:val="17"/>
               </w:rPr>
-              <w:t>Provides the visible corridor for the programmed campus route.</w:t>
+              <w:t>Guides the robot below block 1, above block 2, and below block 3.</w:t>
             </w:r>
           </w:p>
         </w:tc>
@@ -1907,7 +1939,7 @@
                 <w:color w:val="263238"/>
                 <w:sz w:val="17"/>
               </w:rPr>
-              <w:t>Show the common route start and end location in different colors.</w:t>
+              <w:t>Mark separate endpoints at (-3.8, 1.7) m and (3.8, 1.7) m.</w:t>
             </w:r>
           </w:p>
         </w:tc>
@@ -1977,7 +2009,7 @@
     </w:p>
     <w:p>
       <w:r>
-        <w:t>The autonomy node stores seven two-dimensional target points. At each control step it reads the estimated pose, calculates distance and heading to the current target, turns toward it, and drives forward when aligned. It advances when the robot reaches the waypoint tolerance. The route returns to (x=0, y=0), where the robot begins.</w:t>
+        <w:t>The autonomy node stores nine world-frame target points that form an S-shaped route around the blocks. It captures spawn odometry as the local origin and converts each target to that frame. At each control step it calculates distance and heading, turns toward the target, and drives forward when aligned. It advances within 0.12 m of a target and stops after a 180-second watchdog timeout.</w:t>
       </w:r>
     </w:p>
     <w:p>
@@ -1990,7 +2022,7 @@
     </w:p>
     <w:p>
       <w:r>
-        <w:t>The controller examines the forward sector of the LiDAR scan. When an obstacle is closer than its configured threshold, it reduces or stops forward motion and turns toward the side with more clearance. This is a simple reactive rule; it does not create a map or plan a globally optimal path.</w:t>
+        <w:t>The controller checks the forward LiDAR sector and compares left and right clearance. Below the 0.65 m avoidance threshold it turns toward the clearer side, or stops if neither side has enough room. Returns shorter than 0.40 m are filtered by the controller to reduce self-echoes. This reactive layer complements the fixed roadmap; it does not create a map or provide global path planning.</w:t>
       </w:r>
     </w:p>
     <w:p>
@@ -2003,7 +2035,7 @@
     </w:p>
     <w:p>
       <w:r>
-        <w:t>The simulation includes a status sign that changes from STARTED to FINISHED after the route success signal. Gazebo provides pause, play, and camera controls. A separate keyboard node can request manual driving; W/S move forward or reverse, A/D turn, Space stops, and Q requests automatic mode again.</w:t>
+        <w:t>The display node spawns a SIMULATION STARTED sign when Gazebo is ready, then replaces it with ROUTE FINISHED after route success. Gazebo provides pause, play, and camera controls. A separate keyboard node can request manual driving; W/I move forward, S/K reverse, A/J turn left, D/L turn right, Space stops, and Q requests automatic mode again.</w:t>
       </w:r>
     </w:p>
     <w:p>
@@ -2016,7 +2048,7 @@
     </w:p>
     <w:p>
       <w:r>
-        <w:t>The evaluator listens to odometry, LiDAR, velocity commands, and route completion. It writes a CSV containing elapsed time, odometry-based path length, closest LiDAR returns, scan counts, near-obstacle scan counts, stop commands, and route success.</w:t>
+        <w:t>The evaluator listens to odometry, LiDAR, velocity commands, and route completion. It writes a CSV containing elapsed time, odometry-based path length, minimum raw LiDAR returns, scan counts, zero-velocity command samples, and route success. The CSV is saved on successful completion or when the evaluator shuts down.</w:t>
       </w:r>
     </w:p>
     <w:p>
@@ -2324,7 +2356,7 @@
     </w:p>
     <w:p>
       <w:r>
-        <w:t>The waypoint controller uses these seven targets in order. Coordinates are in meters in the Gazebo world frame. The final point returns to the origin, so the start and finish markers flank the same route endpoint.</w:t>
+        <w:t>The controller uses these nine targets in order. Coordinates are in meters in the Gazebo world frame. The robot spawns at (-3.8, 1.7) m and ends at the separate red pad at (3.8, 1.7) m. The three blocks are centered at (-2.5, 1.7), (0, 1.7), and (2.5, 1.7) m.</w:t>
       </w:r>
     </w:p>
     <w:tbl>
@@ -2449,7 +2481,7 @@
                 <w:color w:val="263238"/>
                 <w:sz w:val="17"/>
               </w:rPr>
-              <w:t>(0.0, 2.0)</w:t>
+              <w:t>(-3.2, 1.70)</w:t>
             </w:r>
           </w:p>
         </w:tc>
@@ -2470,7 +2502,7 @@
                 <w:color w:val="263238"/>
                 <w:sz w:val="17"/>
               </w:rPr>
-              <w:t>Move from the origin onto the central route.</w:t>
+              <w:t>Line up before block 1.</w:t>
             </w:r>
           </w:p>
         </w:tc>
@@ -2516,7 +2548,7 @@
                 <w:color w:val="263238"/>
                 <w:sz w:val="17"/>
               </w:rPr>
-              <w:t>(3.5, 2.0)</w:t>
+              <w:t>(-3.2, 0.65)</w:t>
             </w:r>
           </w:p>
         </w:tc>
@@ -2538,7 +2570,7 @@
                 <w:color w:val="263238"/>
                 <w:sz w:val="17"/>
               </w:rPr>
-              <w:t>Visit the east-side branch.</w:t>
+              <w:t>Pass below block 1.</w:t>
             </w:r>
           </w:p>
         </w:tc>
@@ -2582,7 +2614,7 @@
                 <w:color w:val="263238"/>
                 <w:sz w:val="17"/>
               </w:rPr>
-              <w:t>(3.5, 1.5)</w:t>
+              <w:t>(-1.35, 0.65)</w:t>
             </w:r>
           </w:p>
         </w:tc>
@@ -2603,7 +2635,7 @@
                 <w:color w:val="263238"/>
                 <w:sz w:val="17"/>
               </w:rPr>
-              <w:t>Turn onto the crossing path.</w:t>
+              <w:t>Travel between blocks 1 and 2.</w:t>
             </w:r>
           </w:p>
         </w:tc>
@@ -2649,7 +2681,7 @@
                 <w:color w:val="263238"/>
                 <w:sz w:val="17"/>
               </w:rPr>
-              <w:t>(-3.5, 1.5)</w:t>
+              <w:t>(-1.35, 2.75)</w:t>
             </w:r>
           </w:p>
         </w:tc>
@@ -2671,7 +2703,7 @@
                 <w:color w:val="263238"/>
                 <w:sz w:val="17"/>
               </w:rPr>
-              <w:t>Traverse to the west-side branch.</w:t>
+              <w:t>Turn around the left side of block 2.</w:t>
             </w:r>
           </w:p>
         </w:tc>
@@ -2715,7 +2747,7 @@
                 <w:color w:val="263238"/>
                 <w:sz w:val="17"/>
               </w:rPr>
-              <w:t>(-3.5, 2.0)</w:t>
+              <w:t>(1.35, 2.75)</w:t>
             </w:r>
           </w:p>
         </w:tc>
@@ -2736,7 +2768,7 @@
                 <w:color w:val="263238"/>
                 <w:sz w:val="17"/>
               </w:rPr>
-              <w:t>Return to the upper route.</w:t>
+              <w:t>Pass above block 2.</w:t>
             </w:r>
           </w:p>
         </w:tc>
@@ -2782,7 +2814,7 @@
                 <w:color w:val="263238"/>
                 <w:sz w:val="17"/>
               </w:rPr>
-              <w:t>(0.0, 2.0)</w:t>
+              <w:t>(1.35, 0.65)</w:t>
             </w:r>
           </w:p>
         </w:tc>
@@ -2804,7 +2836,7 @@
                 <w:color w:val="263238"/>
                 <w:sz w:val="17"/>
               </w:rPr>
-              <w:t>Rejoin the center line.</w:t>
+              <w:t>Turn below block 2.</w:t>
             </w:r>
           </w:p>
         </w:tc>
@@ -2848,7 +2880,7 @@
                 <w:color w:val="263238"/>
                 <w:sz w:val="17"/>
               </w:rPr>
-              <w:t>(0.0, 0.0)</w:t>
+              <w:t>(3.2, 0.65)</w:t>
             </w:r>
           </w:p>
         </w:tc>
@@ -2869,7 +2901,140 @@
                 <w:color w:val="263238"/>
                 <w:sz w:val="17"/>
               </w:rPr>
-              <w:t>Return to the start and finish point.</w:t>
+              <w:t>Pass below block 3.</w:t>
+            </w:r>
+          </w:p>
+        </w:tc>
+      </w:tr>
+      <w:tr>
+        <w:tc>
+          <w:tcPr>
+            <w:tcW w:type="dxa" w:w="1728"/>
+            <w:vAlign w:val="center"/>
+            <w:shd w:fill="F3F6F9"/>
+          </w:tcPr>
+          <w:p>
+            <w:pPr>
+              <w:spacing w:after="20"/>
+            </w:pPr>
+            <w:r/>
+            <w:r>
+              <w:rPr>
+                <w:rFonts w:ascii="Aptos" w:hAnsi="Aptos"/>
+                <w:b w:val="0"/>
+                <w:color w:val="263238"/>
+                <w:sz w:val="17"/>
+              </w:rPr>
+              <w:t>8</w:t>
+            </w:r>
+          </w:p>
+        </w:tc>
+        <w:tc>
+          <w:tcPr>
+            <w:tcW w:type="dxa" w:w="2304"/>
+            <w:vAlign w:val="center"/>
+            <w:shd w:fill="F3F6F9"/>
+          </w:tcPr>
+          <w:p>
+            <w:pPr>
+              <w:spacing w:after="20"/>
+            </w:pPr>
+            <w:r/>
+            <w:r>
+              <w:rPr>
+                <w:rFonts w:ascii="Aptos" w:hAnsi="Aptos"/>
+                <w:b w:val="0"/>
+                <w:color w:val="263238"/>
+                <w:sz w:val="17"/>
+              </w:rPr>
+              <w:t>(3.2, 1.70)</w:t>
+            </w:r>
+          </w:p>
+        </w:tc>
+        <w:tc>
+          <w:tcPr>
+            <w:tcW w:type="dxa" w:w="5688"/>
+            <w:vAlign w:val="center"/>
+            <w:shd w:fill="F3F6F9"/>
+          </w:tcPr>
+          <w:p>
+            <w:pPr>
+              <w:spacing w:after="20"/>
+            </w:pPr>
+            <w:r/>
+            <w:r>
+              <w:rPr>
+                <w:rFonts w:ascii="Aptos" w:hAnsi="Aptos"/>
+                <w:b w:val="0"/>
+                <w:color w:val="263238"/>
+                <w:sz w:val="17"/>
+              </w:rPr>
+              <w:t>Rejoin the east-side path.</w:t>
+            </w:r>
+          </w:p>
+        </w:tc>
+      </w:tr>
+      <w:tr>
+        <w:tc>
+          <w:tcPr>
+            <w:tcW w:type="dxa" w:w="1728"/>
+            <w:vAlign w:val="center"/>
+          </w:tcPr>
+          <w:p>
+            <w:pPr>
+              <w:spacing w:after="20"/>
+            </w:pPr>
+            <w:r/>
+            <w:r>
+              <w:rPr>
+                <w:rFonts w:ascii="Aptos" w:hAnsi="Aptos"/>
+                <w:b w:val="0"/>
+                <w:color w:val="263238"/>
+                <w:sz w:val="17"/>
+              </w:rPr>
+              <w:t>9</w:t>
+            </w:r>
+          </w:p>
+        </w:tc>
+        <w:tc>
+          <w:tcPr>
+            <w:tcW w:type="dxa" w:w="2304"/>
+            <w:vAlign w:val="center"/>
+          </w:tcPr>
+          <w:p>
+            <w:pPr>
+              <w:spacing w:after="20"/>
+            </w:pPr>
+            <w:r/>
+            <w:r>
+              <w:rPr>
+                <w:rFonts w:ascii="Aptos" w:hAnsi="Aptos"/>
+                <w:b w:val="0"/>
+                <w:color w:val="263238"/>
+                <w:sz w:val="17"/>
+              </w:rPr>
+              <w:t>(3.8, 1.70)</w:t>
+            </w:r>
+          </w:p>
+        </w:tc>
+        <w:tc>
+          <w:tcPr>
+            <w:tcW w:type="dxa" w:w="5688"/>
+            <w:vAlign w:val="center"/>
+          </w:tcPr>
+          <w:p>
+            <w:pPr>
+              <w:spacing w:after="20"/>
+            </w:pPr>
+            <w:r/>
+            <w:r>
+              <w:rPr>
+                <w:rFonts w:ascii="Aptos" w:hAnsi="Aptos"/>
+                <w:b w:val="0"/>
+                <w:color w:val="263238"/>
+                <w:sz w:val="17"/>
+              </w:rPr>
+              <w:t>Reach the red destination pad.</w:t>
             </w:r>
           </w:p>
         </w:tc>
@@ -2879,11 +3044,6 @@
       <w:pPr>
         <w:spacing w:after="0"/>
       </w:pPr>
-    </w:p>
-    <w:p>
-      <w:r>
-        <w:br w:type="page"/>
-      </w:r>
     </w:p>
     <w:p>
       <w:pPr>
@@ -2971,7 +3131,7 @@
         <w:spacing w:after="60"/>
       </w:pPr>
       <w:r>
-        <w:t>These checks only read installed software and workspace metadata; they do not change partitions or project source files.</w:t>
+        <w:t>Replace 123 in the second-terminal commands with the numeric ROS_DOMAIN_ID printed by the launch terminal.</w:t>
       </w:r>
     </w:p>
     <w:p>
@@ -3030,7 +3190,7 @@
         <w:spacing w:after="60"/>
       </w:pPr>
       <w:r>
-        <w:t>Locate the blue vehicle-style robot and the green start and red finish markers near the shared start/finish area.</w:t>
+        <w:t>Locate the blue vehicle-style robot at the green start pad (-3.8, 1.7 m) and the separate red destination pad (3.8, 1.7 m).</w:t>
       </w:r>
     </w:p>
     <w:p>
@@ -3048,7 +3208,7 @@
         <w:spacing w:after="60"/>
       </w:pPr>
       <w:r>
-        <w:t>The autonomous route begins by itself; keep the launch terminal open to see status and warning messages.</w:t>
+        <w:t>The autonomous route begins after odometry and LiDAR are available. Keep the launch terminal open to see waypoint, obstacle, and completion messages.</w:t>
       </w:r>
     </w:p>
     <w:p>
@@ -3081,12 +3241,12 @@
           <w:color w:val="263238"/>
           <w:sz w:val="16"/>
         </w:rPr>
-        <w:t>source /opt/ros/jazzy/setup.bash &amp;&amp; source ~/Desktop/campus_ws/install/setup.bash &amp;&amp; ros2 topic list</w:t>
+        <w:t>source /opt/ros/jazzy/setup.bash &amp;&amp; source ~/Desktop/campus_ws/install/setup.bash &amp;&amp; export ROS_DOMAIN_ID=123 &amp;&amp; ros2 topic list</w:t>
       </w:r>
     </w:p>
     <w:p>
       <w:r>
-        <w:t>Look for /scan, /odom, /cmd_vel, and /campus_navigation/status. If ros2 is not found, source the ROS and workspace setup files in that terminal. If topics are absent, check that the launch terminal is still running.</w:t>
+        <w:t>Set ROS_DOMAIN_ID to the number printed by the launch terminal (replace `123` in the command), then look for /scan, /odom, /cmd_vel, /campus_navigation/status, /campus_navigation/obstacle_detected, and /campus_navigation/succeeded. If ros2 is not found, source the ROS and workspace setup files in that terminal. If topics are absent, check the launch terminal and the domain value.</w:t>
       </w:r>
     </w:p>
     <w:p>
@@ -3114,7 +3274,7 @@
           <w:color w:val="263238"/>
           <w:sz w:val="16"/>
         </w:rPr>
-        <w:t>source /opt/ros/jazzy/setup.bash &amp;&amp; source ~/Desktop/campus_ws/install/setup.bash &amp;&amp; ros2 topic echo --once /campus_navigation/status</w:t>
+        <w:t>source /opt/ros/jazzy/setup.bash &amp;&amp; source ~/Desktop/campus_ws/install/setup.bash &amp;&amp; export ROS_DOMAIN_ID=123 &amp;&amp; ros2 topic echo --once /campus_navigation/status</w:t>
       </w:r>
     </w:p>
     <w:p>
@@ -3129,7 +3289,7 @@
           <w:color w:val="263238"/>
           <w:sz w:val="16"/>
         </w:rPr>
-        <w:t>source /opt/ros/jazzy/setup.bash &amp;&amp; source ~/Desktop/campus_ws/install/setup.bash &amp;&amp; ros2 topic echo --once /scan</w:t>
+        <w:t>source /opt/ros/jazzy/setup.bash &amp;&amp; source ~/Desktop/campus_ws/install/setup.bash &amp;&amp; export ROS_DOMAIN_ID=123 &amp;&amp; ros2 topic echo --once /scan</w:t>
       </w:r>
     </w:p>
     <w:p>
@@ -3144,7 +3304,7 @@
           <w:color w:val="263238"/>
           <w:sz w:val="16"/>
         </w:rPr>
-        <w:t>source /opt/ros/jazzy/setup.bash &amp;&amp; source ~/Desktop/campus_ws/install/setup.bash &amp;&amp; ros2 topic echo --once /odom</w:t>
+        <w:t>source /opt/ros/jazzy/setup.bash &amp;&amp; source ~/Desktop/campus_ws/install/setup.bash &amp;&amp; export ROS_DOMAIN_ID=123 &amp;&amp; ros2 topic echo --once /odom</w:t>
       </w:r>
     </w:p>
     <w:p>
@@ -3177,12 +3337,12 @@
           <w:color w:val="263238"/>
           <w:sz w:val="16"/>
         </w:rPr>
-        <w:t>source /opt/ros/jazzy/setup.bash &amp;&amp; source ~/Desktop/campus_ws/install/setup.bash &amp;&amp; ros2 run campus_robot_bringup campus_teleop.py</w:t>
+        <w:t>source /opt/ros/jazzy/setup.bash &amp;&amp; source ~/Desktop/campus_ws/install/setup.bash &amp;&amp; export ROS_DOMAIN_ID=123 &amp;&amp; ros2 run campus_robot_bringup campus_teleop.py</w:t>
       </w:r>
     </w:p>
     <w:p>
       <w:r>
-        <w:t>W/S move forward or reverse, A/D turn, Space stops, and Q requests autonomous mode again. Use the terminal running teleoperation to enter keys.</w:t>
+        <w:t>W/I move forward, S/K reverse, A/J turn left, D/L turn right, Space stops, and Q requests autonomous mode again. Use the terminal running teleoperation to enter keys.</w:t>
       </w:r>
     </w:p>
     <w:p>
@@ -3199,7 +3359,7 @@
         <w:spacing w:after="60"/>
       </w:pPr>
       <w:r>
-        <w:t>Wait for the controller to reach waypoint 7 and announce that the route is complete.</w:t>
+        <w:t>Wait for the controller to reach waypoint 9 and announce that the route is complete.</w:t>
       </w:r>
     </w:p>
     <w:p>
@@ -3208,7 +3368,7 @@
         <w:spacing w:after="60"/>
       </w:pPr>
       <w:r>
-        <w:t>Confirm the in-world display says FINISHED and the launch terminal shows the evaluator saved the CSV.</w:t>
+        <w:t>Confirm the in-world display says ROUTE FINISHED and the launch terminal shows the evaluator saved the CSV.</w:t>
       </w:r>
     </w:p>
     <w:p>
@@ -3217,56 +3377,23 @@
         <w:spacing w:after="60"/>
       </w:pPr>
       <w:r>
-        <w:t>After showing the completed route, press Ctrl+C once in the launch terminal to shut down Gazebo and the ROS nodes.</w:t>
+        <w:t>After showing the completed route and confirming the CSV was saved, press Ctrl+C once in the launch terminal to shut down Gazebo and the ROS nodes.</w:t>
       </w:r>
     </w:p>
-    <w:tbl>
-      <w:tblPr>
-        <w:tblStyle w:val="TableGrid"/>
-        <w:tblW w:type="auto" w:w="0"/>
-        <w:tblLook w:firstColumn="1" w:firstRow="1" w:lastColumn="0" w:lastRow="0" w:noHBand="0" w:noVBand="1" w:val="04A0"/>
-      </w:tblPr>
-      <w:tblGrid>
-        <w:gridCol w:w="9994"/>
-      </w:tblGrid>
-      <w:tr>
-        <w:tc>
-          <w:tcPr>
-            <w:tcW w:type="dxa" w:w="9994"/>
-            <w:shd w:fill="EAF2F8"/>
-          </w:tcPr>
-          <w:p>
-            <w:pPr>
-              <w:spacing w:after="40"/>
-            </w:pPr>
-            <w:r>
-              <w:rPr>
-                <w:sz w:val="18"/>
-              </w:rPr>
-            </w:r>
-            <w:r>
-              <w:rPr>
-                <w:b/>
-                <w:color w:val="087E8B"/>
-                <w:sz w:val="18"/>
-              </w:rPr>
-              <w:t xml:space="preserve">Keep the run clean  </w:t>
-            </w:r>
-            <w:r>
-              <w:rPr>
-                <w:color w:val="263238"/>
-                <w:sz w:val="18"/>
-              </w:rPr>
-              <w:t>Do not launch a second Gazebo GUI against the existing world. If a previous simulation is still active, stop it with Ctrl+C before beginning this procedure.</w:t>
-            </w:r>
-          </w:p>
-        </w:tc>
-      </w:tr>
-    </w:tbl>
     <w:p>
       <w:pPr>
-        <w:spacing w:after="0"/>
+        <w:spacing w:before="60" w:after="120"/>
       </w:pPr>
+      <w:r>
+        <w:rPr>
+          <w:b/>
+          <w:color w:val="087E8B"/>
+        </w:rPr>
+        <w:t xml:space="preserve">Keep the run clean: </w:t>
+      </w:r>
+      <w:r>
+        <w:t>Do not launch a second Gazebo GUI against the existing world. If a previous simulation is still active, stop it with Ctrl+C before beginning this procedure.</w:t>
+      </w:r>
     </w:p>
     <w:p>
       <w:pPr>
@@ -3523,11 +3650,6 @@
       </w:pPr>
     </w:p>
     <w:p>
-      <w:r>
-        <w:br w:type="page"/>
-      </w:r>
-    </w:p>
-    <w:p>
       <w:pPr>
         <w:pStyle w:val="Heading1"/>
       </w:pPr>
@@ -3537,7 +3659,7 @@
     </w:p>
     <w:p>
       <w:r>
-        <w:t>During a successful demonstration, Gazebo should show the campus environment and vehicle-style robot. ROS 2 should publish LiDAR data on /scan, odometry on /odom, and velocity commands on /cmd_vel. The controller should publish waypoint status, respond to nearby obstacles, return to the route endpoint, and trigger the FINISHED sign. The evaluator should save a CSV file.</w:t>
+        <w:t>During a successful demonstration, Gazebo should show the campus environment and vehicle-style robot. ROS 2 should publish LiDAR data on /scan, odometry on /odom, and velocity commands on /cmd_vel. The controller should publish waypoint status, respond to nearby obstacles, reach the red destination after nine route targets, and trigger the ROUTE FINISHED sign. The evaluator should save a CSV file.</w:t>
       </w:r>
     </w:p>
     <w:p>
@@ -3581,7 +3703,7 @@
                 <w:color w:val="FFFFFF"/>
                 <w:sz w:val="18"/>
               </w:rPr>
-              <w:t>Measure</w:t>
+              <w:t>Metric</w:t>
             </w:r>
           </w:p>
         </w:tc>
@@ -3603,7 +3725,7 @@
                 <w:color w:val="FFFFFF"/>
                 <w:sz w:val="18"/>
               </w:rPr>
-              <w:t>Meaning</w:t>
+              <w:t>Latest saved successful run</w:t>
             </w:r>
           </w:p>
         </w:tc>
@@ -3626,7 +3748,7 @@
                 <w:color w:val="263238"/>
                 <w:sz w:val="17"/>
               </w:rPr>
-              <w:t>elapsed_seconds</w:t>
+              <w:t>Route result</w:t>
             </w:r>
           </w:p>
         </w:tc>
@@ -3647,7 +3769,7 @@
                 <w:color w:val="263238"/>
                 <w:sz w:val="17"/>
               </w:rPr>
-              <w:t>Time from the start of evaluation to route completion or stop.</w:t>
+              <w:t>Succeeded (route_succeeded=True)</w:t>
             </w:r>
           </w:p>
         </w:tc>
@@ -3671,7 +3793,7 @@
                 <w:color w:val="263238"/>
                 <w:sz w:val="17"/>
               </w:rPr>
-              <w:t>path_length_m</w:t>
+              <w:t>Elapsed time</w:t>
             </w:r>
           </w:p>
         </w:tc>
@@ -3693,7 +3815,7 @@
                 <w:color w:val="263238"/>
                 <w:sz w:val="17"/>
               </w:rPr>
-              <w:t>Distance accumulated from odometry.</w:t>
+              <w:t>137.96 s</w:t>
             </w:r>
           </w:p>
         </w:tc>
@@ -3716,7 +3838,7 @@
                 <w:color w:val="263238"/>
                 <w:sz w:val="17"/>
               </w:rPr>
-              <w:t>minimum_obstacle_m</w:t>
+              <w:t>Odometry path length</w:t>
             </w:r>
           </w:p>
         </w:tc>
@@ -3737,7 +3859,7 @@
                 <w:color w:val="263238"/>
                 <w:sz w:val="17"/>
               </w:rPr>
-              <w:t>Closest valid LiDAR return from any direction.</w:t>
+              <w:t>13.058 m</w:t>
             </w:r>
           </w:p>
         </w:tc>
@@ -3761,7 +3883,7 @@
                 <w:color w:val="263238"/>
                 <w:sz w:val="17"/>
               </w:rPr>
-              <w:t>minimum_front_obstacle_m</w:t>
+              <w:t>Minimum raw LiDAR return</w:t>
             </w:r>
           </w:p>
         </w:tc>
@@ -3783,7 +3905,7 @@
                 <w:color w:val="263238"/>
                 <w:sz w:val="17"/>
               </w:rPr>
-              <w:t>Closest valid LiDAR return in the forward sector.</w:t>
+              <w:t>0.260 m</w:t>
             </w:r>
           </w:p>
         </w:tc>
@@ -3806,7 +3928,7 @@
                 <w:color w:val="263238"/>
                 <w:sz w:val="17"/>
               </w:rPr>
-              <w:t>scan_count and near_obstacle_scans</w:t>
+              <w:t>Minimum raw forward return (±30°)</w:t>
             </w:r>
           </w:p>
         </w:tc>
@@ -3827,7 +3949,7 @@
                 <w:color w:val="263238"/>
                 <w:sz w:val="17"/>
               </w:rPr>
-              <w:t>Number of scans and scans classified near an obstacle.</w:t>
+              <w:t>0.581 m</w:t>
             </w:r>
           </w:p>
         </w:tc>
@@ -3851,7 +3973,7 @@
                 <w:color w:val="263238"/>
                 <w:sz w:val="17"/>
               </w:rPr>
-              <w:t>stop_commands</w:t>
+              <w:t>LiDAR scans</w:t>
             </w:r>
           </w:p>
         </w:tc>
@@ -3873,7 +3995,7 @@
                 <w:color w:val="263238"/>
                 <w:sz w:val="17"/>
               </w:rPr>
-              <w:t>Number of commands where the robot was stopped.</w:t>
+              <w:t>1,117</w:t>
             </w:r>
           </w:p>
         </w:tc>
@@ -3896,7 +4018,7 @@
                 <w:color w:val="263238"/>
                 <w:sz w:val="17"/>
               </w:rPr>
-              <w:t>route_succeeded</w:t>
+              <w:t>Scans with raw nearest range under 1 m</w:t>
             </w:r>
           </w:p>
         </w:tc>
@@ -3917,7 +4039,53 @@
                 <w:color w:val="263238"/>
                 <w:sz w:val="17"/>
               </w:rPr>
-              <w:t>Whether the route completion message was received.</w:t>
+              <w:t>1,022</w:t>
+            </w:r>
+          </w:p>
+        </w:tc>
+      </w:tr>
+      <w:tr>
+        <w:tc>
+          <w:tcPr>
+            <w:tcW w:type="dxa" w:w="3312"/>
+            <w:vAlign w:val="center"/>
+            <w:shd w:fill="F3F6F9"/>
+          </w:tcPr>
+          <w:p>
+            <w:pPr>
+              <w:spacing w:after="20"/>
+            </w:pPr>
+            <w:r/>
+            <w:r>
+              <w:rPr>
+                <w:rFonts w:ascii="Aptos" w:hAnsi="Aptos"/>
+                <w:b w:val="0"/>
+                <w:color w:val="263238"/>
+                <w:sz w:val="17"/>
+              </w:rPr>
+              <w:t>Zero-velocity command samples</w:t>
+            </w:r>
+          </w:p>
+        </w:tc>
+        <w:tc>
+          <w:tcPr>
+            <w:tcW w:type="dxa" w:w="6408"/>
+            <w:vAlign w:val="center"/>
+            <w:shd w:fill="F3F6F9"/>
+          </w:tcPr>
+          <w:p>
+            <w:pPr>
+              <w:spacing w:after="20"/>
+            </w:pPr>
+            <w:r/>
+            <w:r>
+              <w:rPr>
+                <w:rFonts w:ascii="Aptos" w:hAnsi="Aptos"/>
+                <w:b w:val="0"/>
+                <w:color w:val="263238"/>
+                <w:sz w:val="17"/>
+              </w:rPr>
+              <w:t>10</w:t>
             </w:r>
           </w:p>
         </w:tc>
@@ -3928,53 +4096,20 @@
         <w:spacing w:after="0"/>
       </w:pPr>
     </w:p>
-    <w:tbl>
-      <w:tblPr>
-        <w:tblStyle w:val="TableGrid"/>
-        <w:tblW w:type="auto" w:w="0"/>
-        <w:tblLook w:firstColumn="1" w:firstRow="1" w:lastColumn="0" w:lastRow="0" w:noHBand="0" w:noVBand="1" w:val="04A0"/>
-      </w:tblPr>
-      <w:tblGrid>
-        <w:gridCol w:w="9994"/>
-      </w:tblGrid>
-      <w:tr>
-        <w:tc>
-          <w:tcPr>
-            <w:tcW w:type="dxa" w:w="9994"/>
-            <w:shd w:fill="EAF2F8"/>
-          </w:tcPr>
-          <w:p>
-            <w:pPr>
-              <w:spacing w:after="40"/>
-            </w:pPr>
-            <w:r>
-              <w:rPr>
-                <w:sz w:val="18"/>
-              </w:rPr>
-            </w:r>
-            <w:r>
-              <w:rPr>
-                <w:b/>
-                <w:color w:val="087E8B"/>
-                <w:sz w:val="18"/>
-              </w:rPr>
-              <w:t xml:space="preserve">Result accuracy  </w:t>
-            </w:r>
-            <w:r>
-              <w:rPr>
-                <w:color w:val="263238"/>
-                <w:sz w:val="18"/>
-              </w:rPr>
-              <w:t>An earlier version completed all seven waypoints and produced saved graphs. Those measurements were collected before the latest campus scenery and tree obstacles were added. Treat them as historical results only; run the current map again to obtain demonstration-day metrics.</w:t>
-            </w:r>
-          </w:p>
-        </w:tc>
-      </w:tr>
-    </w:tbl>
     <w:p>
       <w:pPr>
-        <w:spacing w:after="0"/>
+        <w:spacing w:before="60" w:after="120"/>
       </w:pPr>
+      <w:r>
+        <w:rPr>
+          <w:b/>
+          <w:color w:val="087E8B"/>
+        </w:rPr>
+        <w:t xml:space="preserve">Latest saved successful run: </w:t>
+      </w:r>
+      <w:r>
+        <w:t>The CSV records route_succeeded=True, 137.96 s elapsed, 13.058 m odometry path, 0.260 m minimum raw LiDAR return, 0.581 m minimum raw forward return, 1,117 scans, 1,022 scans with a raw return under 1 m, and 10 zero-velocity command samples. These are single-run values. Raw minima may include robot self-echoes and are not verified collision-clearance measurements. Three summary graphs in graphs/ show all available result points from the saved and verified evaluation CSV files.</w:t>
+      </w:r>
     </w:p>
     <w:p>
       <w:pPr>
@@ -4219,7 +4354,7 @@
                 <w:color w:val="263238"/>
                 <w:sz w:val="17"/>
               </w:rPr>
-              <w:t>The controller reports route completion and the sign changes to FINISHED.</w:t>
+              <w:t>The controller reports route completion and the sign changes to ROUTE FINISHED.</w:t>
             </w:r>
           </w:p>
         </w:tc>
@@ -4307,7 +4442,7 @@
         <w:spacing w:after="60"/>
       </w:pPr>
       <w:r>
-        <w:t>The project does not currently use SLAM, map-based localization, Nav2, or a trained AI model.</w:t>
+        <w:t>The project does not currently use SLAM, map-based localization, Nav2, or a trained AI/ML model.</w:t>
       </w:r>
     </w:p>
     <w:p>
@@ -4379,15 +4514,6 @@
       </w:pPr>
       <w:r>
         <w:t>Create repeatable test scenarios and compare route time, path length, clearance, and success rate over multiple runs.</w:t>
-      </w:r>
-    </w:p>
-    <w:p>
-      <w:pPr>
-        <w:pStyle w:val="ListBullet"/>
-        <w:spacing w:after="60"/>
-      </w:pPr>
-      <w:r>
-        <w:t>If AI is a project requirement, add a clearly defined learning task and compare it against the existing rule-based baseline.</w:t>
       </w:r>
     </w:p>
     <w:p>
@@ -4765,7 +4891,7 @@
                 <w:color w:val="263238"/>
                 <w:sz w:val="17"/>
               </w:rPr>
-              <w:t>5. AI extension</w:t>
+              <w:t>5. Evaluation</w:t>
             </w:r>
           </w:p>
         </w:tc>
@@ -4786,7 +4912,7 @@
                 <w:color w:val="263238"/>
                 <w:sz w:val="17"/>
               </w:rPr>
-              <w:t>Choose a measurable learning task and compare with the rule-based baseline.</w:t>
+              <w:t>Add contact monitoring and repeated controlled trials.</w:t>
             </w:r>
           </w:p>
         </w:tc>
@@ -4807,7 +4933,7 @@
                 <w:color w:val="263238"/>
                 <w:sz w:val="17"/>
               </w:rPr>
-              <w:t>Make the AI contribution testable.</w:t>
+              <w:t>Measure success and collisions across runs.</w:t>
             </w:r>
           </w:p>
         </w:tc>
@@ -4841,7 +4967,7 @@
     </w:p>
     <w:p>
       <w:r>
-        <w:t>Campus Drive AI brings together a simulated campus, a differential-drive robot, LiDAR and odometry, ROS 2 communication, waypoint control, reactive obstacle handling, and automatic performance logging. It gives a clear demonstration of how sensor information becomes movement commands and how a simulation run can be evaluated. The current implementation is a practical foundation for future work in mapping, localization, and advanced navigation.</w:t>
+        <w:t>Campus Drive AI brings together a simulated campus, a differential-drive robot, LiDAR and odometry, ROS 2 communication, a nine-target S-shaped route around three fixed blocks, reactive obstacle handling, an in-world completion sign, and automatic performance logging. The latest saved successful run completed in 137.96 seconds with a 13.058 m odometry path. Its raw LiDAR metrics require caution because self-echoes are not excluded by the evaluator. The implementation is a learning prototype that can be extended with repeat trials, collision monitoring, mapping, and more advanced navigation.</w:t>
       </w:r>
     </w:p>
     <w:sectPr>
@@ -4889,7 +5015,7 @@
         <w:color w:val="087E8B"/>
         <w:sz w:val="16"/>
       </w:rPr>
-      <w:t>CAMPUS DRIVE AI  |  ROS 2 CAMPUS ROBOTICS</w:t>
+      <w:t>CAMPUS DRIVE AI  |  ROS 2 AND GAZEBO ROBOTICS</w:t>
     </w:r>
   </w:p>
 </w:hdr>

</xml_diff>

<commit_message>
Add campus road and evaluation bar charts
</commit_message>
<xml_diff>
--- a/Campus_Drive_AI_Project_Demonstration.docx
+++ b/Campus_Drive_AI_Project_Demonstration.docx
@@ -1782,7 +1782,7 @@
                 <w:color w:val="263238"/>
                 <w:sz w:val="17"/>
               </w:rPr>
-              <w:t>Yellow S-shaped route</w:t>
+              <w:t>Paved road with dashed center markings</w:t>
             </w:r>
           </w:p>
         </w:tc>
@@ -3815,7 +3815,7 @@
                 <w:color w:val="263238"/>
                 <w:sz w:val="17"/>
               </w:rPr>
-              <w:t>137.96 s</w:t>
+              <w:t>146.62 s</w:t>
             </w:r>
           </w:p>
         </w:tc>
@@ -3859,7 +3859,7 @@
                 <w:color w:val="263238"/>
                 <w:sz w:val="17"/>
               </w:rPr>
-              <w:t>13.058 m</w:t>
+              <w:t>13.056 m</w:t>
             </w:r>
           </w:p>
         </w:tc>
@@ -3905,7 +3905,7 @@
                 <w:color w:val="263238"/>
                 <w:sz w:val="17"/>
               </w:rPr>
-              <w:t>0.260 m</w:t>
+              <w:t>0.250 m</w:t>
             </w:r>
           </w:p>
         </w:tc>
@@ -3949,7 +3949,7 @@
                 <w:color w:val="263238"/>
                 <w:sz w:val="17"/>
               </w:rPr>
-              <w:t>0.581 m</w:t>
+              <w:t>0.537 m</w:t>
             </w:r>
           </w:p>
         </w:tc>
@@ -3995,7 +3995,7 @@
                 <w:color w:val="263238"/>
                 <w:sz w:val="17"/>
               </w:rPr>
-              <w:t>1,117</w:t>
+              <w:t>1,113</w:t>
             </w:r>
           </w:p>
         </w:tc>
@@ -4039,7 +4039,7 @@
                 <w:color w:val="263238"/>
                 <w:sz w:val="17"/>
               </w:rPr>
-              <w:t>1,022</w:t>
+              <w:t>1,011</w:t>
             </w:r>
           </w:p>
         </w:tc>
@@ -4108,7 +4108,7 @@
         <w:t xml:space="preserve">Latest saved successful run: </w:t>
       </w:r>
       <w:r>
-        <w:t>The CSV records route_succeeded=True, 137.96 s elapsed, 13.058 m odometry path, 0.260 m minimum raw LiDAR return, 0.581 m minimum raw forward return, 1,117 scans, 1,022 scans with a raw return under 1 m, and 10 zero-velocity command samples. These are single-run values. Raw minima may include robot self-echoes and are not verified collision-clearance measurements. Three summary graphs in graphs/ show all available result points from the saved and verified evaluation CSV files.</w:t>
+        <w:t>The CSV records route_succeeded=True, 146.62 s elapsed, 13.056 m odometry path, 0.250 m minimum raw LiDAR return, 0.537 m minimum raw forward return, 1,113 scans, 1,011 scans with a raw return under 1 m, and 10 zero-velocity command samples. These are single-run values. Raw minima may include robot self-echoes and are not verified collision-clearance measurements. Five summary graphs in graphs/ show all available result points from the saved and verified evaluation CSV files.</w:t>
       </w:r>
     </w:p>
     <w:p>
@@ -4967,7 +4967,7 @@
     </w:p>
     <w:p>
       <w:r>
-        <w:t>Campus Drive AI brings together a simulated campus, a differential-drive robot, LiDAR and odometry, ROS 2 communication, a nine-target S-shaped route around three fixed blocks, reactive obstacle handling, an in-world completion sign, and automatic performance logging. The latest saved successful run completed in 137.96 seconds with a 13.058 m odometry path. Its raw LiDAR metrics require caution because self-echoes are not excluded by the evaluator. The implementation is a learning prototype that can be extended with repeat trials, collision monitoring, mapping, and more advanced navigation.</w:t>
+        <w:t>Campus Drive AI brings together a simulated campus, a differential-drive robot, LiDAR and odometry, ROS 2 communication, a nine-target S-shaped route around three fixed blocks, reactive obstacle handling, an in-world completion sign, and automatic performance logging. The latest saved successful run completed in 146.62 seconds with a 13.056 m odometry path. Its raw LiDAR metrics require caution because self-echoes are not excluded by the evaluator. The implementation is a learning prototype that can be extended with repeat trials, collision monitoring, mapping, and more advanced navigation.</w:t>
       </w:r>
     </w:p>
     <w:sectPr>

</xml_diff>